<commit_message>
fix(briefings): correct Briefing 04 core position, fraud example, and closing line
Define the governed object as the decision to allow a specific
consequential execution.

Co-Authored-By: Claude Opus 5.5 <noreply@anthropic.com>
</commit_message>
<xml_diff>
--- a/briefings-source/Strategic_Intelligence_Briefing_04.docx
+++ b/briefings-source/Strategic_Intelligence_Briefing_04.docx
@@ -254,7 +254,7 @@
                 <w:color w:val="FFFFFF"/>
                 <w:sz w:val="24"/>
               </w:rPr>
-              <w:t>The AI agent is only a participant in the control problem. The decision is the governed object because the decision carries consequence, authority, evidence, and institutional accountability.</w:t>
+              <w:t>The AI agent is only a participant in the control problem. The governed object is the decision to allow a consequential execution, because that decision carries consequence, authority, evidence, and institutional accountability.</w:t>
             </w:r>
           </w:p>
         </w:tc>
@@ -358,7 +358,7 @@
         <w:rPr>
           <w:rFonts w:ascii="Aptos" w:hAnsi="Aptos"/>
         </w:rPr>
-        <w:t>A fraud review agent may flag a transaction, but if its recommendation changes investigation priority, customer treatment, account restriction, or escalation timing, the governed object is not the agent record. The governed object is the decision path that converted AI participation into institutional action.</w:t>
+        <w:t>A fraud review agent may flag a transaction. When it proposes to restrict an account or hold a payment, the governed object is not the agent record. It is the authority decision for that exact action, made before the account system executes it.</w:t>
       </w:r>
     </w:p>
     <w:p>
@@ -530,7 +530,7 @@
         <w:rPr>
           <w:rFonts w:ascii="Aptos" w:hAnsi="Aptos"/>
         </w:rPr>
-        <w:t>The next enterprise control standard will not be satisfied by asking whether the agent was approved. It will require proof that the AI influenced decision path was authorized before the enterprise acted.</w:t>
+        <w:t>The next enterprise control standard will not be satisfied by asking whether the agent was approved. It will require proof that the exact execution was authorized before the downstream system acted.</w:t>
       </w:r>
     </w:p>
     <w:p>

</xml_diff>